<commit_message>
new update for UI and dataset for project
</commit_message>
<xml_diff>
--- a/Bao_cao_nghien_cuu_de_tai_v2.docx
+++ b/Bao_cao_nghien_cuu_de_tai_v2.docx
@@ -5,27 +5,6 @@
     <w:p/>
     <w:p/>
     <w:p/>
-    <w:p>
-      <w:pPr>
-        <w:jc w:val="center"/>
-      </w:pPr>
-      <w:r>
-        <w:rPr>
-          <w:b/>
-          <w:sz w:val="28"/>
-        </w:rPr>
-        <w:t>TRƯỜNG ĐẠI HỌC ...................</w:t>
-      </w:r>
-      <w:r>
-        <w:rPr>
-          <w:b/>
-          <w:sz w:val="28"/>
-        </w:rPr>
-        <w:br/>
-        <w:t>KHOA CÔNG NGHỆ THÔNG TIN</w:t>
-      </w:r>
-    </w:p>
-    <w:p/>
     <w:p/>
     <w:p/>
     <w:p>
@@ -106,7 +85,6 @@
         <w:jc w:val="center"/>
       </w:pPr>
       <w:r>
-        <w:lastRenderedPageBreak/>
         <w:t>Ngày lập báo cáo: 24/02/2026</w:t>
       </w:r>
     </w:p>
@@ -134,7 +112,7 @@
           <w:b/>
           <w:color w:val="003399"/>
         </w:rPr>
-        <w:t>CHƯƠNG 1: GIỚI THIỆU VỀ CƠ SỞ LÝ THUYẾT</w:t>
+        <w:t>CHƯƠNG 1: CƠ SỞ LÝ THUYẾT</w:t>
       </w:r>
     </w:p>
     <w:p>
@@ -291,12 +269,17 @@
       </w:r>
     </w:p>
     <w:p>
+      <w:pPr>
+        <w:rPr>
+          <w:lang w:val="vi-VN"/>
+        </w:rPr>
+      </w:pPr>
       <w:r>
         <w:rPr>
           <w:color w:val="000000"/>
           <w:sz w:val="24"/>
         </w:rPr>
-        <w:t xml:space="preserve">      1.5.2. MobileNetV2 và đặc điểm kiến trúc</w:t>
+        <w:t xml:space="preserve">      1.5.2. MobileNetV2</w:t>
       </w:r>
     </w:p>
     <w:p>
@@ -392,12 +375,25 @@
     </w:p>
     <w:p/>
     <w:p>
+      <w:pPr>
+        <w:rPr>
+          <w:lang w:val="vi-VN"/>
+        </w:rPr>
+      </w:pPr>
       <w:r>
         <w:rPr>
           <w:b/>
           <w:color w:val="003399"/>
         </w:rPr>
         <w:t>CHƯƠNG 2: PHƯƠNG PHÁP ĐỀ XUẤT</w:t>
+      </w:r>
+      <w:r>
+        <w:rPr>
+          <w:b/>
+          <w:color w:val="003399"/>
+          <w:lang w:val="vi-VN"/>
+        </w:rPr>
+        <w:t xml:space="preserve"> ….??</w:t>
       </w:r>
     </w:p>
     <w:p>
@@ -880,9 +876,62 @@
     <w:p>
       <w:pPr>
         <w:ind w:firstLine="720"/>
+        <w:rPr>
+          <w:lang w:val="vi-VN"/>
+        </w:rPr>
       </w:pPr>
       <w:r>
         <w:t>Hệ thống phân loại 7 cảm xúc cơ bản của Paul Ekman được sử dụng làm tiêu chuẩn trong hầu hết các nghiên cứu FER. Mỗi cảm xúc tương ứng với một tập hợp các chuyển động cơ mặt đặc trưng, được gọi là Action Units (AU) trong hệ thống FACS (Facial Action Coding System).</w:t>
+      </w:r>
+    </w:p>
+    <w:p>
+      <w:pPr>
+        <w:ind w:firstLine="720"/>
+        <w:rPr>
+          <w:lang w:val="vi-VN"/>
+        </w:rPr>
+      </w:pPr>
+      <w:r>
+        <w:rPr>
+          <w:noProof/>
+          <w:lang w:val="vi-VN"/>
+        </w:rPr>
+        <w:lastRenderedPageBreak/>
+        <w:drawing>
+          <wp:inline distT="0" distB="0" distL="0" distR="0" wp14:anchorId="5A100995" wp14:editId="4294D260">
+            <wp:extent cx="4728752" cy="4218660"/>
+            <wp:effectExtent l="0" t="0" r="0" b="0"/>
+            <wp:docPr id="548814075" name="Picture 1"/>
+            <wp:cNvGraphicFramePr>
+              <a:graphicFrameLocks xmlns:a="http://schemas.openxmlformats.org/drawingml/2006/main" noChangeAspect="1"/>
+            </wp:cNvGraphicFramePr>
+            <a:graphic xmlns:a="http://schemas.openxmlformats.org/drawingml/2006/main">
+              <a:graphicData uri="http://schemas.openxmlformats.org/drawingml/2006/picture">
+                <pic:pic xmlns:pic="http://schemas.openxmlformats.org/drawingml/2006/picture">
+                  <pic:nvPicPr>
+                    <pic:cNvPr id="548814075" name="Picture 548814075"/>
+                    <pic:cNvPicPr/>
+                  </pic:nvPicPr>
+                  <pic:blipFill>
+                    <a:blip r:embed="rId6"/>
+                    <a:stretch>
+                      <a:fillRect/>
+                    </a:stretch>
+                  </pic:blipFill>
+                  <pic:spPr>
+                    <a:xfrm>
+                      <a:off x="0" y="0"/>
+                      <a:ext cx="4737330" cy="4226313"/>
+                    </a:xfrm>
+                    <a:prstGeom prst="rect">
+                      <a:avLst/>
+                    </a:prstGeom>
+                  </pic:spPr>
+                </pic:pic>
+              </a:graphicData>
+            </a:graphic>
+          </wp:inline>
+        </w:drawing>
       </w:r>
     </w:p>
     <w:p>
@@ -893,11 +942,10 @@
         <w:rPr>
           <w:noProof/>
         </w:rPr>
-        <w:lastRenderedPageBreak/>
         <w:drawing>
-          <wp:inline distT="0" distB="0" distL="0" distR="0" wp14:anchorId="4A1CB626" wp14:editId="4A849B42">
-            <wp:extent cx="5029200" cy="2612715"/>
-            <wp:effectExtent l="0" t="0" r="0" b="0"/>
+          <wp:inline distT="0" distB="0" distL="0" distR="0" wp14:anchorId="4A1CB626" wp14:editId="60A13094">
+            <wp:extent cx="5066674" cy="2612390"/>
+            <wp:effectExtent l="0" t="0" r="635" b="0"/>
             <wp:docPr id="1" name="Picture 1"/>
             <wp:cNvGraphicFramePr>
               <a:graphicFrameLocks xmlns:a="http://schemas.openxmlformats.org/drawingml/2006/main" noChangeAspect="1"/>
@@ -910,7 +958,7 @@
                     <pic:cNvPicPr/>
                   </pic:nvPicPr>
                   <pic:blipFill>
-                    <a:blip r:embed="rId6"/>
+                    <a:blip r:embed="rId7"/>
                     <a:stretch>
                       <a:fillRect/>
                     </a:stretch>
@@ -918,7 +966,7 @@
                   <pic:spPr>
                     <a:xfrm>
                       <a:off x="0" y="0"/>
-                      <a:ext cx="5029200" cy="2612715"/>
+                      <a:ext cx="5069694" cy="2613947"/>
                     </a:xfrm>
                     <a:prstGeom prst="rect">
                       <a:avLst/>
@@ -1035,6 +1083,7 @@
               <w:rPr>
                 <w:sz w:val="22"/>
               </w:rPr>
+              <w:lastRenderedPageBreak/>
               <w:t>Angry</w:t>
             </w:r>
           </w:p>
@@ -1395,7 +1444,6 @@
           <w:rFonts w:ascii="Times New Roman" w:hAnsi="Times New Roman"/>
           <w:color w:val="000000"/>
         </w:rPr>
-        <w:lastRenderedPageBreak/>
         <w:t>1.3. Tổng quan về Deep Learning trong Computer Vision</w:t>
       </w:r>
     </w:p>
@@ -1447,6 +1495,7 @@
         <w:rPr>
           <w:noProof/>
         </w:rPr>
+        <w:lastRenderedPageBreak/>
         <w:drawing>
           <wp:anchor distT="0" distB="0" distL="114300" distR="114300" simplePos="0" relativeHeight="251658240" behindDoc="1" locked="0" layoutInCell="1" allowOverlap="1" wp14:anchorId="5C450971" wp14:editId="250C5CE0">
             <wp:simplePos x="0" y="0"/>
@@ -1479,7 +1528,7 @@
                     <pic:cNvPicPr/>
                   </pic:nvPicPr>
                   <pic:blipFill>
-                    <a:blip r:embed="rId7"/>
+                    <a:blip r:embed="rId8"/>
                     <a:stretch>
                       <a:fillRect/>
                     </a:stretch>
@@ -1533,7 +1582,6 @@
           <w:rFonts w:ascii="Times New Roman" w:hAnsi="Times New Roman"/>
           <w:color w:val="000000"/>
         </w:rPr>
-        <w:lastRenderedPageBreak/>
         <w:t>1.3.3. Các thành phần của CNN (Conv, Pooling, BatchNorm, Dropout, Softmax)</w:t>
       </w:r>
     </w:p>
@@ -1928,6 +1976,7 @@
               <w:rPr>
                 <w:sz w:val="22"/>
               </w:rPr>
+              <w:lastRenderedPageBreak/>
               <w:t>GlobalAveragePooling</w:t>
             </w:r>
           </w:p>
@@ -2039,7 +2088,7 @@
                     <pic:cNvPicPr/>
                   </pic:nvPicPr>
                   <pic:blipFill>
-                    <a:blip r:embed="rId8"/>
+                    <a:blip r:embed="rId9"/>
                     <a:stretch>
                       <a:fillRect/>
                     </a:stretch>
@@ -2076,7 +2125,6 @@
           <w:i/>
           <w:sz w:val="22"/>
         </w:rPr>
-        <w:lastRenderedPageBreak/>
         <w:t>Hình 3: Squeeze-and-Excitation (SE) Block</w:t>
       </w:r>
     </w:p>
@@ -2116,6 +2164,7 @@
         <w:rPr>
           <w:noProof/>
         </w:rPr>
+        <w:lastRenderedPageBreak/>
         <w:drawing>
           <wp:anchor distT="0" distB="0" distL="114300" distR="114300" simplePos="0" relativeHeight="251660288" behindDoc="1" locked="0" layoutInCell="1" allowOverlap="1" wp14:anchorId="2D3600B9" wp14:editId="062934BE">
             <wp:simplePos x="0" y="0"/>
@@ -2148,7 +2197,7 @@
                     <pic:cNvPicPr/>
                   </pic:nvPicPr>
                   <pic:blipFill>
-                    <a:blip r:embed="rId9"/>
+                    <a:blip r:embed="rId10"/>
                     <a:stretch>
                       <a:fillRect/>
                     </a:stretch>
@@ -2437,7 +2486,6 @@
               <w:rPr>
                 <w:sz w:val="22"/>
               </w:rPr>
-              <w:lastRenderedPageBreak/>
               <w:t>Parameters tăng thêm</w:t>
             </w:r>
           </w:p>
@@ -2506,7 +2554,11 @@
         <w:ind w:firstLine="720"/>
       </w:pPr>
       <w:r>
-        <w:t>Transfer Learning là kỹ thuật sử dụng model đã được huấn luyện trên tập dữ liệu lớn (ImageNet – 1.2 triệu ảnh) làm điểm khởi đầu, sau đó fine-tune cho bài toán cụ thể. Lợi ích: tận dụng features đã học, tiết kiệm thời gian, cải thiện accuracy khi data ít.</w:t>
+        <w:t xml:space="preserve">Transfer Learning là kỹ thuật sử dụng model đã được huấn luyện trên tập dữ liệu lớn (ImageNet – 1.2 triệu ảnh) làm điểm khởi đầu, sau đó fine-tune cho bài </w:t>
+      </w:r>
+      <w:r>
+        <w:lastRenderedPageBreak/>
+        <w:t>toán cụ thể. Lợi ích: tận dụng features đã học, tiết kiệm thời gian, cải thiện accuracy khi data ít.</w:t>
       </w:r>
     </w:p>
     <w:p>
@@ -2565,7 +2617,7 @@
                     <pic:cNvPicPr/>
                   </pic:nvPicPr>
                   <pic:blipFill>
-                    <a:blip r:embed="rId10"/>
+                    <a:blip r:embed="rId11"/>
                     <a:stretch>
                       <a:fillRect/>
                     </a:stretch>
@@ -2616,7 +2668,6 @@
           <w:rFonts w:ascii="Times New Roman" w:hAnsi="Times New Roman"/>
           <w:color w:val="000000"/>
         </w:rPr>
-        <w:lastRenderedPageBreak/>
         <w:t>1.6. Các kỹ thuật cải thiện hiệu năng mô hình</w:t>
       </w:r>
     </w:p>
@@ -2771,6 +2822,7 @@
               <w:rPr>
                 <w:sz w:val="22"/>
               </w:rPr>
+              <w:lastRenderedPageBreak/>
               <w:t>Width/Height Shift</w:t>
             </w:r>
           </w:p>
@@ -3043,7 +3095,6 @@
           <w:rFonts w:ascii="Times New Roman" w:hAnsi="Times New Roman"/>
           <w:color w:val="000000"/>
         </w:rPr>
-        <w:lastRenderedPageBreak/>
         <w:t>1.7. Dataset sử dụng</w:t>
       </w:r>
     </w:p>
@@ -3076,6 +3127,7 @@
           <w:rFonts w:ascii="Times New Roman" w:hAnsi="Times New Roman"/>
           <w:color w:val="000000"/>
         </w:rPr>
+        <w:lastRenderedPageBreak/>
         <w:t>1.7.2. Phân tích đặc điểm dữ liệu</w:t>
       </w:r>
     </w:p>
@@ -3103,7 +3155,7 @@
                     <pic:cNvPicPr/>
                   </pic:nvPicPr>
                   <pic:blipFill>
-                    <a:blip r:embed="rId11"/>
+                    <a:blip r:embed="rId12"/>
                     <a:stretch>
                       <a:fillRect/>
                     </a:stretch>
@@ -3705,7 +3757,6 @@
           <w:rFonts w:ascii="Times New Roman" w:hAnsi="Times New Roman"/>
           <w:color w:val="000000"/>
         </w:rPr>
-        <w:lastRenderedPageBreak/>
         <w:t>1.7.3. Vấn đề mất cân bằng và noisy labels</w:t>
       </w:r>
     </w:p>
@@ -3904,7 +3955,7 @@
                     <pic:cNvPicPr/>
                   </pic:nvPicPr>
                   <pic:blipFill>
-                    <a:blip r:embed="rId12"/>
+                    <a:blip r:embed="rId13"/>
                     <a:stretch>
                       <a:fillRect/>
                     </a:stretch>
@@ -5408,7 +5459,7 @@
                     <pic:cNvPicPr/>
                   </pic:nvPicPr>
                   <pic:blipFill>
-                    <a:blip r:embed="rId13"/>
+                    <a:blip r:embed="rId14"/>
                     <a:stretch>
                       <a:fillRect/>
                     </a:stretch>
@@ -6326,7 +6377,7 @@
                     <pic:cNvPicPr/>
                   </pic:nvPicPr>
                   <pic:blipFill>
-                    <a:blip r:embed="rId7"/>
+                    <a:blip r:embed="rId8"/>
                     <a:stretch>
                       <a:fillRect/>
                     </a:stretch>

</xml_diff>